<commit_message>
Add team details and pipeline link
</commit_message>
<xml_diff>
--- a/docs/Test-Strategy-Group-6-Reservations.docx
+++ b/docs/Test-Strategy-Group-6-Reservations.docx
@@ -25,7 +25,7 @@
         <w:spacing w:after="160"/>
       </w:pPr>
       <w:r>
-        <w:t xml:space="preserve">Course: FHB MCCE Test Automation Assignment: Group Assignment - Test Strategy, Automation and CI/CD System Under Test: Library Management System Assigned domain: Group 6 - Reservations Test repository purpose: Automated verification of the reservation domain, including API, business-rule, negative-path, and UI/E2E coverage.</w:t>
+        <w:t xml:space="preserve">Course: FHB MCCE Test Automation Assignment: Group Assignment - Test Strategy, Automation and CI/CD System Under Test: Library Management System Assigned domain: Group 6 - Reservations Group members: Josefine Malek-Matous (`2510781010@hochschule-burgenland.at`), Phillip Fuhrmann (`2510781029@hochschule-burgenland.at`), Manuel Nussbaumer (`2510781027@hochschule-burgenland.at`) Test repository purpose: Automated verification of the reservation domain, including API, business-rule, negative-path, and UI/E2E coverage.</w:t>
       </w:r>
     </w:p>
     <w:p>
@@ -2964,7 +2964,7 @@
         <w:spacing w:after="160"/>
       </w:pPr>
       <w:r>
-        <w:t xml:space="preserve">Pipeline run URL for submission: add the first successful hosted GitHub Actions run URL here after pushing the repository.</w:t>
+        <w:t xml:space="preserve">Successful pipeline run URL for submission: https://github.com/djmanu/DEVOPS-PT-HORVATH/actions/runs/27313467115</w:t>
       </w:r>
     </w:p>
     <w:p>

</xml_diff>